<commit_message>
updates made to case study file, add backlinks
</commit_message>
<xml_diff>
--- a/LLM Response Evaluation - Case Study.docx
+++ b/LLM Response Evaluation - Case Study.docx
@@ -283,6 +283,15 @@
       <w:pPr>
         <w:rPr>
           <w:rFonts w:ascii="Arial" w:hAnsi="Arial" w:cs="Arial"/>
+        </w:rPr>
+      </w:pPr>
+    </w:p>
+    <w:p>
+      <w:pPr>
+        <w:rPr>
+          <w:rFonts w:ascii="Arial" w:hAnsi="Arial" w:cs="Arial"/>
+          <w:sz w:val="32"/>
+          <w:szCs w:val="32"/>
         </w:rPr>
       </w:pPr>
     </w:p>
@@ -1320,7 +1329,7 @@
     </w:p>
     <w:p>
       <w:pPr>
-        <w:pStyle w:val="36"/>
+        <w:pStyle w:val="38"/>
         <w:rPr>
           <w:rFonts w:ascii="Arial" w:hAnsi="Arial" w:cs="Arial"/>
         </w:rPr>
@@ -1334,7 +1343,7 @@
     </w:p>
     <w:p>
       <w:pPr>
-        <w:pStyle w:val="13"/>
+        <w:pStyle w:val="15"/>
         <w:rPr>
           <w:rFonts w:ascii="Arial" w:hAnsi="Arial" w:cs="Arial"/>
           <w:b/>
@@ -1349,7 +1358,7 @@
       </w:r>
       <w:r>
         <w:rPr>
-          <w:rStyle w:val="14"/>
+          <w:rStyle w:val="16"/>
           <w:rFonts w:ascii="Arial" w:hAnsi="Arial" w:cs="Arial"/>
           <w:b w:val="0"/>
           <w:bCs w:val="0"/>
@@ -1364,7 +1373,7 @@
       </w:r>
       <w:r>
         <w:rPr>
-          <w:rStyle w:val="14"/>
+          <w:rStyle w:val="16"/>
           <w:rFonts w:ascii="Arial" w:hAnsi="Arial" w:cs="Arial"/>
           <w:b w:val="0"/>
           <w:bCs w:val="0"/>
@@ -1428,579 +1437,7 @@
     </w:p>
     <w:tbl>
       <w:tblPr>
-        <w:tblStyle w:val="12"/>
-        <w:tblW w:w="0" w:type="auto"/>
-        <w:tblCellSpacing w:w="15" w:type="dxa"/>
-        <w:tblInd w:w="0" w:type="dxa"/>
-        <w:tblLayout w:type="autofit"/>
-        <w:tblCellMar>
-          <w:top w:w="15" w:type="dxa"/>
-          <w:left w:w="15" w:type="dxa"/>
-          <w:bottom w:w="15" w:type="dxa"/>
-          <w:right w:w="15" w:type="dxa"/>
-        </w:tblCellMar>
-      </w:tblPr>
-      <w:tblGrid>
-        <w:gridCol w:w="1890"/>
-        <w:gridCol w:w="7470"/>
-      </w:tblGrid>
-      <w:tr>
-        <w:tblPrEx>
-          <w:tblCellMar>
-            <w:top w:w="15" w:type="dxa"/>
-            <w:left w:w="15" w:type="dxa"/>
-            <w:bottom w:w="15" w:type="dxa"/>
-            <w:right w:w="15" w:type="dxa"/>
-          </w:tblCellMar>
-        </w:tblPrEx>
-        <w:trPr>
-          <w:tblHeader/>
-          <w:tblCellSpacing w:w="15" w:type="dxa"/>
-        </w:trPr>
-        <w:tc>
-          <w:tcPr>
-            <w:tcW w:w="1845" w:type="dxa"/>
-            <w:vAlign w:val="center"/>
-          </w:tcPr>
-          <w:p>
-            <w:pPr>
-              <w:rPr>
-                <w:rFonts w:ascii="Arial" w:hAnsi="Arial" w:cs="Arial"/>
-                <w:b/>
-                <w:bCs/>
-              </w:rPr>
-            </w:pPr>
-            <w:r>
-              <w:rPr>
-                <w:rFonts w:ascii="Arial" w:hAnsi="Arial" w:cs="Arial"/>
-                <w:b/>
-                <w:bCs/>
-              </w:rPr>
-              <w:t>Severity</w:t>
-            </w:r>
-          </w:p>
-        </w:tc>
-        <w:tc>
-          <w:tcPr>
-            <w:tcW w:w="7425" w:type="dxa"/>
-            <w:vAlign w:val="center"/>
-          </w:tcPr>
-          <w:p>
-            <w:pPr>
-              <w:rPr>
-                <w:rFonts w:ascii="Arial" w:hAnsi="Arial" w:cs="Arial"/>
-                <w:b/>
-                <w:bCs/>
-              </w:rPr>
-            </w:pPr>
-            <w:r>
-              <w:rPr>
-                <w:rFonts w:ascii="Arial" w:hAnsi="Arial" w:cs="Arial"/>
-                <w:b/>
-                <w:bCs/>
-              </w:rPr>
-              <w:t>Description</w:t>
-            </w:r>
-          </w:p>
-        </w:tc>
-      </w:tr>
-      <w:tr>
-        <w:tblPrEx>
-          <w:tblCellMar>
-            <w:top w:w="15" w:type="dxa"/>
-            <w:left w:w="15" w:type="dxa"/>
-            <w:bottom w:w="15" w:type="dxa"/>
-            <w:right w:w="15" w:type="dxa"/>
-          </w:tblCellMar>
-        </w:tblPrEx>
-        <w:trPr>
-          <w:tblCellSpacing w:w="15" w:type="dxa"/>
-        </w:trPr>
-        <w:tc>
-          <w:tcPr>
-            <w:tcW w:w="1845" w:type="dxa"/>
-            <w:vAlign w:val="center"/>
-          </w:tcPr>
-          <w:p>
-            <w:pPr>
-              <w:rPr>
-                <w:rFonts w:ascii="Arial" w:hAnsi="Arial" w:cs="Arial"/>
-              </w:rPr>
-            </w:pPr>
-            <w:r>
-              <w:rPr>
-                <w:rFonts w:ascii="Arial" w:hAnsi="Arial" w:cs="Arial"/>
-                <w:b/>
-                <w:bCs/>
-              </w:rPr>
-              <w:t>None</w:t>
-            </w:r>
-          </w:p>
-        </w:tc>
-        <w:tc>
-          <w:tcPr>
-            <w:tcW w:w="7425" w:type="dxa"/>
-            <w:vAlign w:val="center"/>
-          </w:tcPr>
-          <w:p>
-            <w:pPr>
-              <w:rPr>
-                <w:rFonts w:ascii="Arial" w:hAnsi="Arial" w:cs="Arial"/>
-              </w:rPr>
-            </w:pPr>
-            <w:r>
-              <w:rPr>
-                <w:rFonts w:ascii="Arial" w:hAnsi="Arial" w:cs="Arial"/>
-              </w:rPr>
-              <w:t>No identifiable error</w:t>
-            </w:r>
-          </w:p>
-        </w:tc>
-      </w:tr>
-      <w:tr>
-        <w:tblPrEx>
-          <w:tblCellMar>
-            <w:top w:w="15" w:type="dxa"/>
-            <w:left w:w="15" w:type="dxa"/>
-            <w:bottom w:w="15" w:type="dxa"/>
-            <w:right w:w="15" w:type="dxa"/>
-          </w:tblCellMar>
-        </w:tblPrEx>
-        <w:trPr>
-          <w:tblCellSpacing w:w="15" w:type="dxa"/>
-        </w:trPr>
-        <w:tc>
-          <w:tcPr>
-            <w:tcW w:w="1845" w:type="dxa"/>
-            <w:vAlign w:val="center"/>
-          </w:tcPr>
-          <w:p>
-            <w:pPr>
-              <w:rPr>
-                <w:rFonts w:ascii="Arial" w:hAnsi="Arial" w:cs="Arial"/>
-              </w:rPr>
-            </w:pPr>
-            <w:r>
-              <w:rPr>
-                <w:rFonts w:ascii="Arial" w:hAnsi="Arial" w:cs="Arial"/>
-                <w:b/>
-                <w:bCs/>
-              </w:rPr>
-              <w:t>Minor</w:t>
-            </w:r>
-          </w:p>
-        </w:tc>
-        <w:tc>
-          <w:tcPr>
-            <w:tcW w:w="7425" w:type="dxa"/>
-            <w:vAlign w:val="center"/>
-          </w:tcPr>
-          <w:p>
-            <w:pPr>
-              <w:rPr>
-                <w:rFonts w:ascii="Arial" w:hAnsi="Arial" w:cs="Arial"/>
-              </w:rPr>
-            </w:pPr>
-            <w:r>
-              <w:rPr>
-                <w:rFonts w:ascii="Arial" w:hAnsi="Arial" w:cs="Arial"/>
-              </w:rPr>
-              <w:t>Limited impact on response quality and does not substantially affect the user's ability to use the answer</w:t>
-            </w:r>
-          </w:p>
-        </w:tc>
-      </w:tr>
-      <w:tr>
-        <w:tblPrEx>
-          <w:tblCellMar>
-            <w:top w:w="15" w:type="dxa"/>
-            <w:left w:w="15" w:type="dxa"/>
-            <w:bottom w:w="15" w:type="dxa"/>
-            <w:right w:w="15" w:type="dxa"/>
-          </w:tblCellMar>
-        </w:tblPrEx>
-        <w:trPr>
-          <w:tblCellSpacing w:w="15" w:type="dxa"/>
-        </w:trPr>
-        <w:tc>
-          <w:tcPr>
-            <w:tcW w:w="1845" w:type="dxa"/>
-            <w:vAlign w:val="center"/>
-          </w:tcPr>
-          <w:p>
-            <w:pPr>
-              <w:rPr>
-                <w:rFonts w:ascii="Arial" w:hAnsi="Arial" w:cs="Arial"/>
-              </w:rPr>
-            </w:pPr>
-            <w:r>
-              <w:rPr>
-                <w:rFonts w:ascii="Arial" w:hAnsi="Arial" w:cs="Arial"/>
-                <w:b/>
-                <w:bCs/>
-              </w:rPr>
-              <w:t>Moderate</w:t>
-            </w:r>
-          </w:p>
-        </w:tc>
-        <w:tc>
-          <w:tcPr>
-            <w:tcW w:w="7425" w:type="dxa"/>
-            <w:vAlign w:val="center"/>
-          </w:tcPr>
-          <w:p>
-            <w:pPr>
-              <w:rPr>
-                <w:rFonts w:ascii="Arial" w:hAnsi="Arial" w:cs="Arial"/>
-              </w:rPr>
-            </w:pPr>
-            <w:r>
-              <w:rPr>
-                <w:rFonts w:ascii="Arial" w:hAnsi="Arial" w:cs="Arial"/>
-              </w:rPr>
-              <w:t>Meaningfully affects the quality, usefulness, or reliability of the response</w:t>
-            </w:r>
-          </w:p>
-        </w:tc>
-      </w:tr>
-      <w:tr>
-        <w:tblPrEx>
-          <w:tblCellMar>
-            <w:top w:w="15" w:type="dxa"/>
-            <w:left w:w="15" w:type="dxa"/>
-            <w:bottom w:w="15" w:type="dxa"/>
-            <w:right w:w="15" w:type="dxa"/>
-          </w:tblCellMar>
-        </w:tblPrEx>
-        <w:trPr>
-          <w:tblCellSpacing w:w="15" w:type="dxa"/>
-        </w:trPr>
-        <w:tc>
-          <w:tcPr>
-            <w:tcW w:w="1845" w:type="dxa"/>
-            <w:vAlign w:val="center"/>
-          </w:tcPr>
-          <w:p>
-            <w:pPr>
-              <w:rPr>
-                <w:rFonts w:ascii="Arial" w:hAnsi="Arial" w:cs="Arial"/>
-              </w:rPr>
-            </w:pPr>
-            <w:r>
-              <w:rPr>
-                <w:rFonts w:ascii="Arial" w:hAnsi="Arial" w:cs="Arial"/>
-                <w:b/>
-                <w:bCs/>
-              </w:rPr>
-              <w:t>Major</w:t>
-            </w:r>
-          </w:p>
-        </w:tc>
-        <w:tc>
-          <w:tcPr>
-            <w:tcW w:w="7425" w:type="dxa"/>
-            <w:vAlign w:val="center"/>
-          </w:tcPr>
-          <w:p>
-            <w:pPr>
-              <w:rPr>
-                <w:rFonts w:ascii="Arial" w:hAnsi="Arial" w:cs="Arial"/>
-              </w:rPr>
-            </w:pPr>
-            <w:r>
-              <w:rPr>
-                <w:rFonts w:ascii="Arial" w:hAnsi="Arial" w:cs="Arial"/>
-              </w:rPr>
-              <w:t>Substantially affects the correctness or usefulness of the response</w:t>
-            </w:r>
-          </w:p>
-        </w:tc>
-      </w:tr>
-      <w:tr>
-        <w:tblPrEx>
-          <w:tblCellMar>
-            <w:top w:w="15" w:type="dxa"/>
-            <w:left w:w="15" w:type="dxa"/>
-            <w:bottom w:w="15" w:type="dxa"/>
-            <w:right w:w="15" w:type="dxa"/>
-          </w:tblCellMar>
-        </w:tblPrEx>
-        <w:trPr>
-          <w:tblCellSpacing w:w="15" w:type="dxa"/>
-        </w:trPr>
-        <w:tc>
-          <w:tcPr>
-            <w:tcW w:w="1845" w:type="dxa"/>
-            <w:vAlign w:val="center"/>
-          </w:tcPr>
-          <w:p>
-            <w:pPr>
-              <w:rPr>
-                <w:rFonts w:ascii="Arial" w:hAnsi="Arial" w:cs="Arial"/>
-              </w:rPr>
-            </w:pPr>
-            <w:r>
-              <w:rPr>
-                <w:rFonts w:ascii="Arial" w:hAnsi="Arial" w:cs="Arial"/>
-                <w:b/>
-                <w:bCs/>
-              </w:rPr>
-              <w:t>Critical</w:t>
-            </w:r>
-          </w:p>
-        </w:tc>
-        <w:tc>
-          <w:tcPr>
-            <w:tcW w:w="7425" w:type="dxa"/>
-            <w:vAlign w:val="center"/>
-          </w:tcPr>
-          <w:p>
-            <w:pPr>
-              <w:rPr>
-                <w:rFonts w:ascii="Arial" w:hAnsi="Arial" w:cs="Arial"/>
-              </w:rPr>
-            </w:pPr>
-            <w:r>
-              <w:rPr>
-                <w:rFonts w:ascii="Arial" w:hAnsi="Arial" w:cs="Arial"/>
-              </w:rPr>
-              <w:t>Creates a serious risk of harm, particularly in safety-sensitive contexts</w:t>
-            </w:r>
-          </w:p>
-        </w:tc>
-      </w:tr>
-    </w:tbl>
-    <w:p>
-      <w:pPr>
-        <w:rPr>
-          <w:rFonts w:ascii="Arial" w:hAnsi="Arial" w:cs="Arial"/>
-        </w:rPr>
-      </w:pPr>
-    </w:p>
-    <w:p>
-      <w:pPr>
-        <w:rPr>
-          <w:rFonts w:ascii="Arial" w:hAnsi="Arial" w:cs="Arial"/>
-          <w:sz w:val="32"/>
-          <w:szCs w:val="32"/>
-        </w:rPr>
-      </w:pPr>
-      <w:r>
-        <w:rPr>
-          <w:rFonts w:ascii="Arial" w:hAnsi="Arial" w:cs="Arial"/>
-          <w:sz w:val="32"/>
-          <w:szCs w:val="32"/>
-        </w:rPr>
-        <w:t>Annotation Methodology</w:t>
-      </w:r>
-    </w:p>
-    <w:p>
-      <w:pPr>
-        <w:rPr>
-          <w:rFonts w:ascii="Arial" w:hAnsi="Arial" w:cs="Arial"/>
-        </w:rPr>
-      </w:pPr>
-      <w:r>
-        <w:rPr>
-          <w:rFonts w:ascii="Arial" w:hAnsi="Arial" w:cs="Arial"/>
-        </w:rPr>
-        <w:t>Prompts were reviewed alongside the corresponding AI responses, after which each response was independently assessed across six quality dimensions. Identified errors were categorized using the predefined error taxonomy and assigned severity according to the established safety framework. Each annotation was supported by a concise evidence-based justification.</w:t>
-      </w:r>
-    </w:p>
-    <w:p>
-      <w:pPr>
-        <w:rPr>
-          <w:rFonts w:ascii="Arial" w:hAnsi="Arial" w:cs="Arial"/>
-        </w:rPr>
-      </w:pPr>
-      <w:r>
-        <w:rPr>
-          <w:rFonts w:ascii="Arial" w:hAnsi="Arial" w:cs="Arial"/>
-        </w:rPr>
-        <w:t>Supporting Document: Annotation Guidelines</w:t>
-      </w:r>
-    </w:p>
-    <w:p>
-      <w:pPr>
-        <w:rPr>
-          <w:rFonts w:ascii="Arial" w:hAnsi="Arial" w:cs="Arial"/>
-        </w:rPr>
-      </w:pPr>
-    </w:p>
-    <w:p>
-      <w:pPr>
-        <w:rPr>
-          <w:rFonts w:ascii="Arial" w:hAnsi="Arial" w:cs="Arial"/>
-          <w:sz w:val="32"/>
-          <w:szCs w:val="32"/>
-        </w:rPr>
-      </w:pPr>
-      <w:r>
-        <w:rPr>
-          <w:rFonts w:ascii="Arial" w:hAnsi="Arial" w:cs="Arial"/>
-          <w:sz w:val="32"/>
-          <w:szCs w:val="32"/>
-        </w:rPr>
-        <w:t>Quality Control</w:t>
-      </w:r>
-    </w:p>
-    <w:p>
-      <w:pPr>
-        <w:pStyle w:val="31"/>
-        <w:numPr>
-          <w:ilvl w:val="0"/>
-          <w:numId w:val="3"/>
-        </w:numPr>
-        <w:rPr>
-          <w:rFonts w:ascii="Arial" w:hAnsi="Arial" w:cs="Arial"/>
-          <w:sz w:val="32"/>
-          <w:szCs w:val="32"/>
-        </w:rPr>
-      </w:pPr>
-      <w:r>
-        <w:rPr>
-          <w:rFonts w:ascii="Arial" w:hAnsi="Arial" w:cs="Arial"/>
-        </w:rPr>
-        <w:t xml:space="preserve">Independent evaluation </w:t>
-      </w:r>
-    </w:p>
-    <w:p>
-      <w:pPr>
-        <w:pStyle w:val="31"/>
-        <w:numPr>
-          <w:ilvl w:val="0"/>
-          <w:numId w:val="3"/>
-        </w:numPr>
-        <w:rPr>
-          <w:rFonts w:ascii="Arial" w:hAnsi="Arial" w:cs="Arial"/>
-          <w:sz w:val="32"/>
-          <w:szCs w:val="32"/>
-        </w:rPr>
-      </w:pPr>
-      <w:r>
-        <w:rPr>
-          <w:rFonts w:ascii="Arial" w:hAnsi="Arial" w:cs="Arial"/>
-        </w:rPr>
-        <w:t xml:space="preserve">Calibration </w:t>
-      </w:r>
-    </w:p>
-    <w:p>
-      <w:pPr>
-        <w:pStyle w:val="31"/>
-        <w:numPr>
-          <w:ilvl w:val="0"/>
-          <w:numId w:val="3"/>
-        </w:numPr>
-        <w:rPr>
-          <w:rFonts w:ascii="Arial" w:hAnsi="Arial" w:cs="Arial"/>
-          <w:sz w:val="32"/>
-          <w:szCs w:val="32"/>
-        </w:rPr>
-      </w:pPr>
-      <w:r>
-        <w:rPr>
-          <w:rFonts w:ascii="Arial" w:hAnsi="Arial" w:cs="Arial"/>
-        </w:rPr>
-        <w:t xml:space="preserve">Evidence-based adjudication </w:t>
-      </w:r>
-    </w:p>
-    <w:p>
-      <w:pPr>
-        <w:pStyle w:val="31"/>
-        <w:numPr>
-          <w:ilvl w:val="0"/>
-          <w:numId w:val="3"/>
-        </w:numPr>
-        <w:rPr>
-          <w:rFonts w:ascii="Arial" w:hAnsi="Arial" w:cs="Arial"/>
-          <w:sz w:val="32"/>
-          <w:szCs w:val="32"/>
-        </w:rPr>
-      </w:pPr>
-      <w:r>
-        <w:rPr>
-          <w:rFonts w:ascii="Arial" w:hAnsi="Arial" w:cs="Arial"/>
-        </w:rPr>
-        <w:t xml:space="preserve">Disagreement thresholds </w:t>
-      </w:r>
-    </w:p>
-    <w:p>
-      <w:pPr>
-        <w:pStyle w:val="31"/>
-        <w:numPr>
-          <w:ilvl w:val="0"/>
-          <w:numId w:val="3"/>
-        </w:numPr>
-        <w:rPr>
-          <w:rFonts w:ascii="Arial" w:hAnsi="Arial" w:cs="Arial"/>
-          <w:sz w:val="32"/>
-          <w:szCs w:val="32"/>
-        </w:rPr>
-      </w:pPr>
-      <w:r>
-        <w:rPr>
-          <w:rFonts w:ascii="Arial" w:hAnsi="Arial" w:cs="Arial"/>
-        </w:rPr>
-        <w:t>Consistency monitoring</w:t>
-      </w:r>
-    </w:p>
-    <w:p>
-      <w:pPr>
-        <w:rPr>
-          <w:rFonts w:ascii="Arial" w:hAnsi="Arial" w:cs="Arial"/>
-        </w:rPr>
-      </w:pPr>
-      <w:r>
-        <w:rPr>
-          <w:rFonts w:ascii="Arial" w:hAnsi="Arial" w:cs="Arial"/>
-        </w:rPr>
-        <w:t>Supporting Document: Quality-Control Protocol</w:t>
-      </w:r>
-    </w:p>
-    <w:p>
-      <w:pPr>
-        <w:rPr>
-          <w:rFonts w:ascii="Arial" w:hAnsi="Arial" w:cs="Arial"/>
-        </w:rPr>
-      </w:pPr>
-    </w:p>
-    <w:p>
-      <w:pPr>
-        <w:rPr>
-          <w:rFonts w:ascii="Arial" w:hAnsi="Arial" w:cs="Arial"/>
-          <w:sz w:val="32"/>
-          <w:szCs w:val="32"/>
-        </w:rPr>
-      </w:pPr>
-      <w:r>
-        <w:rPr>
-          <w:rFonts w:ascii="Arial" w:hAnsi="Arial" w:cs="Arial"/>
-          <w:sz w:val="32"/>
-          <w:szCs w:val="32"/>
-        </w:rPr>
-        <w:t>Results &amp; Dataset Analysis</w:t>
-      </w:r>
-    </w:p>
-    <w:p>
-      <w:pPr>
-        <w:rPr>
-          <w:rFonts w:ascii="Arial" w:hAnsi="Arial" w:cs="Arial"/>
-          <w:sz w:val="28"/>
-          <w:szCs w:val="28"/>
-        </w:rPr>
-      </w:pPr>
-      <w:r>
-        <w:rPr>
-          <w:rFonts w:ascii="Arial" w:hAnsi="Arial" w:cs="Arial"/>
-          <w:sz w:val="28"/>
-          <w:szCs w:val="28"/>
-        </w:rPr>
-        <w:t>Overall Performance</w:t>
-      </w:r>
-    </w:p>
-    <w:tbl>
-      <w:tblPr>
-        <w:tblStyle w:val="16"/>
+        <w:tblStyle w:val="18"/>
         <w:tblW w:w="0" w:type="auto"/>
         <w:tblInd w:w="0" w:type="dxa"/>
         <w:tblBorders>
@@ -2018,8 +1455,8 @@
         </w:tblCellMar>
       </w:tblPr>
       <w:tblGrid>
-        <w:gridCol w:w="4788"/>
-        <w:gridCol w:w="4788"/>
+        <w:gridCol w:w="1910"/>
+        <w:gridCol w:w="7666"/>
       </w:tblGrid>
       <w:tr>
         <w:tblPrEx>
@@ -2038,14 +1475,12 @@
         </w:tblPrEx>
         <w:tc>
           <w:tcPr>
-            <w:tcW w:w="4788" w:type="dxa"/>
+            <w:tcW w:w="1910" w:type="dxa"/>
           </w:tcPr>
           <w:p>
             <w:pPr>
               <w:rPr>
                 <w:rFonts w:hint="default" w:ascii="Arial" w:hAnsi="Arial" w:cs="Arial"/>
-                <w:sz w:val="28"/>
-                <w:szCs w:val="28"/>
                 <w:vertAlign w:val="baseline"/>
                 <w:lang w:val="en-US"/>
               </w:rPr>
@@ -2053,25 +1488,21 @@
             <w:r>
               <w:rPr>
                 <w:rFonts w:hint="default" w:ascii="Arial" w:hAnsi="Arial" w:cs="Arial"/>
-                <w:sz w:val="28"/>
-                <w:szCs w:val="28"/>
                 <w:vertAlign w:val="baseline"/>
                 <w:lang w:val="en-US"/>
               </w:rPr>
-              <w:t>Metric</w:t>
+              <w:t>Severity</w:t>
             </w:r>
           </w:p>
         </w:tc>
         <w:tc>
           <w:tcPr>
-            <w:tcW w:w="4788" w:type="dxa"/>
+            <w:tcW w:w="7666" w:type="dxa"/>
           </w:tcPr>
           <w:p>
             <w:pPr>
               <w:rPr>
                 <w:rFonts w:hint="default" w:ascii="Arial" w:hAnsi="Arial" w:cs="Arial"/>
-                <w:sz w:val="28"/>
-                <w:szCs w:val="28"/>
                 <w:vertAlign w:val="baseline"/>
                 <w:lang w:val="en-US"/>
               </w:rPr>
@@ -2079,12 +1510,10 @@
             <w:r>
               <w:rPr>
                 <w:rFonts w:hint="default" w:ascii="Arial" w:hAnsi="Arial" w:cs="Arial"/>
-                <w:sz w:val="28"/>
-                <w:szCs w:val="28"/>
                 <w:vertAlign w:val="baseline"/>
                 <w:lang w:val="en-US"/>
               </w:rPr>
-              <w:t>Result</w:t>
+              <w:t>Description</w:t>
             </w:r>
           </w:p>
         </w:tc>
@@ -2106,14 +1535,12 @@
         </w:tblPrEx>
         <w:tc>
           <w:tcPr>
-            <w:tcW w:w="4788" w:type="dxa"/>
+            <w:tcW w:w="1910" w:type="dxa"/>
           </w:tcPr>
           <w:p>
             <w:pPr>
               <w:rPr>
                 <w:rFonts w:hint="default" w:ascii="Arial" w:hAnsi="Arial" w:cs="Arial"/>
-                <w:sz w:val="28"/>
-                <w:szCs w:val="28"/>
                 <w:vertAlign w:val="baseline"/>
                 <w:lang w:val="en-US"/>
               </w:rPr>
@@ -2121,38 +1548,29 @@
             <w:r>
               <w:rPr>
                 <w:rFonts w:hint="default" w:ascii="Arial" w:hAnsi="Arial" w:cs="Arial"/>
-                <w:sz w:val="28"/>
-                <w:szCs w:val="28"/>
                 <w:vertAlign w:val="baseline"/>
                 <w:lang w:val="en-US"/>
               </w:rPr>
-              <w:t>Total Responses Evaluated</w:t>
+              <w:t>None</w:t>
             </w:r>
           </w:p>
         </w:tc>
         <w:tc>
           <w:tcPr>
-            <w:tcW w:w="4788" w:type="dxa"/>
+            <w:tcW w:w="7666" w:type="dxa"/>
           </w:tcPr>
           <w:p>
             <w:pPr>
               <w:rPr>
-                <w:rFonts w:hint="default" w:ascii="Arial" w:hAnsi="Arial" w:cs="Arial"/>
-                <w:sz w:val="28"/>
-                <w:szCs w:val="28"/>
+                <w:rFonts w:ascii="Arial" w:hAnsi="Arial" w:cs="Arial"/>
                 <w:vertAlign w:val="baseline"/>
-                <w:lang w:val="en-US"/>
               </w:rPr>
             </w:pPr>
             <w:r>
               <w:rPr>
-                <w:rFonts w:hint="default" w:ascii="Arial" w:hAnsi="Arial" w:cs="Arial"/>
-                <w:sz w:val="28"/>
-                <w:szCs w:val="28"/>
-                <w:vertAlign w:val="baseline"/>
-                <w:lang w:val="en-US"/>
-              </w:rPr>
-              <w:t>30</w:t>
+                <w:rFonts w:ascii="Arial" w:hAnsi="Arial" w:cs="Arial"/>
+              </w:rPr>
+              <w:t>No identifiable error</w:t>
             </w:r>
           </w:p>
         </w:tc>
@@ -2174,14 +1592,12 @@
         </w:tblPrEx>
         <w:tc>
           <w:tcPr>
-            <w:tcW w:w="4788" w:type="dxa"/>
+            <w:tcW w:w="1910" w:type="dxa"/>
           </w:tcPr>
           <w:p>
             <w:pPr>
               <w:rPr>
                 <w:rFonts w:hint="default" w:ascii="Arial" w:hAnsi="Arial" w:cs="Arial"/>
-                <w:sz w:val="28"/>
-                <w:szCs w:val="28"/>
                 <w:vertAlign w:val="baseline"/>
                 <w:lang w:val="en-US"/>
               </w:rPr>
@@ -2189,38 +1605,30 @@
             <w:r>
               <w:rPr>
                 <w:rFonts w:hint="default" w:ascii="Arial" w:hAnsi="Arial" w:cs="Arial"/>
-                <w:sz w:val="28"/>
-                <w:szCs w:val="28"/>
                 <w:vertAlign w:val="baseline"/>
                 <w:lang w:val="en-US"/>
               </w:rPr>
-              <w:t>Responses with no identified errors</w:t>
+              <w:t>Minor</w:t>
             </w:r>
           </w:p>
         </w:tc>
         <w:tc>
           <w:tcPr>
-            <w:tcW w:w="4788" w:type="dxa"/>
+            <w:tcW w:w="7666" w:type="dxa"/>
           </w:tcPr>
           <w:p>
             <w:pPr>
               <w:rPr>
                 <w:rFonts w:hint="default" w:ascii="Arial" w:hAnsi="Arial" w:cs="Arial"/>
-                <w:sz w:val="28"/>
-                <w:szCs w:val="28"/>
                 <w:vertAlign w:val="baseline"/>
                 <w:lang w:val="en-US"/>
               </w:rPr>
             </w:pPr>
             <w:r>
               <w:rPr>
-                <w:rFonts w:hint="default" w:ascii="Arial" w:hAnsi="Arial" w:cs="Arial"/>
-                <w:sz w:val="28"/>
-                <w:szCs w:val="28"/>
-                <w:vertAlign w:val="baseline"/>
-                <w:lang w:val="en-US"/>
-              </w:rPr>
-              <w:t>40%</w:t>
+                <w:rFonts w:ascii="Arial" w:hAnsi="Arial" w:cs="Arial"/>
+              </w:rPr>
+              <w:t>Limited impact on response quality and does not substantially affect the user's ability to use the answer</w:t>
             </w:r>
           </w:p>
         </w:tc>
@@ -2242,14 +1650,12 @@
         </w:tblPrEx>
         <w:tc>
           <w:tcPr>
-            <w:tcW w:w="4788" w:type="dxa"/>
+            <w:tcW w:w="1910" w:type="dxa"/>
           </w:tcPr>
           <w:p>
             <w:pPr>
               <w:rPr>
                 <w:rFonts w:hint="default" w:ascii="Arial" w:hAnsi="Arial" w:cs="Arial"/>
-                <w:sz w:val="28"/>
-                <w:szCs w:val="28"/>
                 <w:vertAlign w:val="baseline"/>
                 <w:lang w:val="en-US"/>
               </w:rPr>
@@ -2257,38 +1663,29 @@
             <w:r>
               <w:rPr>
                 <w:rFonts w:hint="default" w:ascii="Arial" w:hAnsi="Arial" w:cs="Arial"/>
-                <w:sz w:val="28"/>
-                <w:szCs w:val="28"/>
                 <w:vertAlign w:val="baseline"/>
                 <w:lang w:val="en-US"/>
               </w:rPr>
-              <w:t>Responses with errors</w:t>
+              <w:t>Moderate</w:t>
             </w:r>
           </w:p>
         </w:tc>
         <w:tc>
           <w:tcPr>
-            <w:tcW w:w="4788" w:type="dxa"/>
+            <w:tcW w:w="7666" w:type="dxa"/>
           </w:tcPr>
           <w:p>
             <w:pPr>
               <w:rPr>
-                <w:rFonts w:hint="default" w:ascii="Arial" w:hAnsi="Arial" w:cs="Arial"/>
-                <w:sz w:val="28"/>
-                <w:szCs w:val="28"/>
+                <w:rFonts w:ascii="Arial" w:hAnsi="Arial" w:cs="Arial"/>
                 <w:vertAlign w:val="baseline"/>
-                <w:lang w:val="en-US"/>
               </w:rPr>
             </w:pPr>
             <w:r>
               <w:rPr>
-                <w:rFonts w:hint="default" w:ascii="Arial" w:hAnsi="Arial" w:cs="Arial"/>
-                <w:sz w:val="28"/>
-                <w:szCs w:val="28"/>
-                <w:vertAlign w:val="baseline"/>
-                <w:lang w:val="en-US"/>
-              </w:rPr>
-              <w:t>60%</w:t>
+                <w:rFonts w:ascii="Arial" w:hAnsi="Arial" w:cs="Arial"/>
+              </w:rPr>
+              <w:t>Meaningfully affects the quality, usefulness, or reliability of the response</w:t>
             </w:r>
           </w:p>
         </w:tc>
@@ -2310,10 +1707,747 @@
         </w:tblPrEx>
         <w:tc>
           <w:tcPr>
+            <w:tcW w:w="1910" w:type="dxa"/>
+          </w:tcPr>
+          <w:p>
+            <w:pPr>
+              <w:rPr>
+                <w:rFonts w:hint="default" w:ascii="Arial" w:hAnsi="Arial" w:cs="Arial"/>
+                <w:vertAlign w:val="baseline"/>
+                <w:lang w:val="en-US"/>
+              </w:rPr>
+            </w:pPr>
+            <w:r>
+              <w:rPr>
+                <w:rFonts w:hint="default" w:ascii="Arial" w:hAnsi="Arial" w:cs="Arial"/>
+                <w:vertAlign w:val="baseline"/>
+                <w:lang w:val="en-US"/>
+              </w:rPr>
+              <w:t>Major</w:t>
+            </w:r>
+          </w:p>
+        </w:tc>
+        <w:tc>
+          <w:tcPr>
+            <w:tcW w:w="7666" w:type="dxa"/>
+          </w:tcPr>
+          <w:p>
+            <w:pPr>
+              <w:rPr>
+                <w:rFonts w:ascii="Arial" w:hAnsi="Arial" w:cs="Arial"/>
+              </w:rPr>
+            </w:pPr>
+            <w:r>
+              <w:rPr>
+                <w:rFonts w:ascii="Arial" w:hAnsi="Arial" w:cs="Arial"/>
+              </w:rPr>
+              <w:t>Substantially affects the correctness or usefulness of the response</w:t>
+            </w:r>
+          </w:p>
+        </w:tc>
+      </w:tr>
+      <w:tr>
+        <w:tblPrEx>
+          <w:tblBorders>
+            <w:top w:val="single" w:color="auto" w:sz="4" w:space="0"/>
+            <w:left w:val="single" w:color="auto" w:sz="4" w:space="0"/>
+            <w:bottom w:val="single" w:color="auto" w:sz="4" w:space="0"/>
+            <w:right w:val="single" w:color="auto" w:sz="4" w:space="0"/>
+            <w:insideH w:val="single" w:color="auto" w:sz="4" w:space="0"/>
+            <w:insideV w:val="single" w:color="auto" w:sz="4" w:space="0"/>
+          </w:tblBorders>
+          <w:tblCellMar>
+            <w:left w:w="108" w:type="dxa"/>
+            <w:right w:w="108" w:type="dxa"/>
+          </w:tblCellMar>
+        </w:tblPrEx>
+        <w:tc>
+          <w:tcPr>
+            <w:tcW w:w="1910" w:type="dxa"/>
+          </w:tcPr>
+          <w:p>
+            <w:pPr>
+              <w:rPr>
+                <w:rFonts w:hint="default" w:ascii="Arial" w:hAnsi="Arial" w:cs="Arial"/>
+                <w:vertAlign w:val="baseline"/>
+                <w:lang w:val="en-US"/>
+              </w:rPr>
+            </w:pPr>
+            <w:r>
+              <w:rPr>
+                <w:rFonts w:hint="default" w:ascii="Arial" w:hAnsi="Arial" w:cs="Arial"/>
+                <w:vertAlign w:val="baseline"/>
+                <w:lang w:val="en-US"/>
+              </w:rPr>
+              <w:t>Critical</w:t>
+            </w:r>
+          </w:p>
+        </w:tc>
+        <w:tc>
+          <w:tcPr>
+            <w:tcW w:w="7666" w:type="dxa"/>
+          </w:tcPr>
+          <w:p>
+            <w:pPr>
+              <w:rPr>
+                <w:rFonts w:ascii="Arial" w:hAnsi="Arial" w:cs="Arial"/>
+              </w:rPr>
+            </w:pPr>
+            <w:r>
+              <w:rPr>
+                <w:rFonts w:ascii="Arial" w:hAnsi="Arial" w:cs="Arial"/>
+              </w:rPr>
+              <w:t>Creates a serious risk of harm, particularly in safety-sensitive contexts</w:t>
+            </w:r>
+          </w:p>
+        </w:tc>
+      </w:tr>
+    </w:tbl>
+    <w:p>
+      <w:pPr>
+        <w:rPr>
+          <w:rFonts w:ascii="Arial" w:hAnsi="Arial" w:cs="Arial"/>
+        </w:rPr>
+      </w:pPr>
+    </w:p>
+    <w:p>
+      <w:pPr>
+        <w:rPr>
+          <w:rFonts w:ascii="Arial" w:hAnsi="Arial" w:cs="Arial"/>
+        </w:rPr>
+      </w:pPr>
+      <w:bookmarkStart w:id="0" w:name="_GoBack"/>
+      <w:bookmarkEnd w:id="0"/>
+    </w:p>
+    <w:p>
+      <w:pPr>
+        <w:rPr>
+          <w:rFonts w:ascii="Arial" w:hAnsi="Arial" w:cs="Arial"/>
+          <w:sz w:val="32"/>
+          <w:szCs w:val="32"/>
+        </w:rPr>
+      </w:pPr>
+      <w:r>
+        <w:rPr>
+          <w:rFonts w:ascii="Arial" w:hAnsi="Arial" w:cs="Arial"/>
+          <w:sz w:val="32"/>
+          <w:szCs w:val="32"/>
+        </w:rPr>
+        <w:t>Annotation Methodology</w:t>
+      </w:r>
+    </w:p>
+    <w:p>
+      <w:pPr>
+        <w:rPr>
+          <w:rFonts w:ascii="Arial" w:hAnsi="Arial" w:cs="Arial"/>
+        </w:rPr>
+      </w:pPr>
+      <w:r>
+        <w:rPr>
+          <w:rFonts w:ascii="Arial" w:hAnsi="Arial" w:cs="Arial"/>
+        </w:rPr>
+        <w:t>Prompts were reviewed alongside the corresponding AI responses, after which each response was independently assessed across six quality dimensions. Identified errors were categorized using the predefined error taxonomy and assigned severity according to the established safety framework. Each annotation was supported by a concise evidence-based justification.</w:t>
+      </w:r>
+    </w:p>
+    <w:p>
+      <w:pPr>
+        <w:rPr>
+          <w:rFonts w:ascii="Arial" w:hAnsi="Arial" w:cs="Arial"/>
+        </w:rPr>
+      </w:pPr>
+      <w:r>
+        <w:rPr>
+          <w:rFonts w:ascii="Arial" w:hAnsi="Arial" w:cs="Arial"/>
+        </w:rPr>
+        <w:t xml:space="preserve">Supporting Document: </w:t>
+      </w:r>
+      <w:r>
+        <w:rPr>
+          <w:rFonts w:ascii="Arial" w:hAnsi="Arial" w:cs="Arial"/>
+        </w:rPr>
+        <w:fldChar w:fldCharType="begin"/>
+      </w:r>
+      <w:r>
+        <w:rPr>
+          <w:rFonts w:ascii="Arial" w:hAnsi="Arial" w:cs="Arial"/>
+        </w:rPr>
+        <w:instrText xml:space="preserve"> HYPERLINK "LLM Response Evaluation - Annotation Guidelines.docx" </w:instrText>
+      </w:r>
+      <w:r>
+        <w:rPr>
+          <w:rFonts w:ascii="Arial" w:hAnsi="Arial" w:cs="Arial"/>
+        </w:rPr>
+        <w:fldChar w:fldCharType="separate"/>
+      </w:r>
+      <w:r>
+        <w:rPr>
+          <w:rStyle w:val="14"/>
+          <w:rFonts w:ascii="Arial" w:hAnsi="Arial" w:cs="Arial"/>
+        </w:rPr>
+        <w:t>Annotation Guidelines</w:t>
+      </w:r>
+      <w:r>
+        <w:rPr>
+          <w:rFonts w:ascii="Arial" w:hAnsi="Arial" w:cs="Arial"/>
+        </w:rPr>
+        <w:fldChar w:fldCharType="end"/>
+      </w:r>
+    </w:p>
+    <w:p>
+      <w:pPr>
+        <w:rPr>
+          <w:rFonts w:ascii="Arial" w:hAnsi="Arial" w:cs="Arial"/>
+        </w:rPr>
+      </w:pPr>
+    </w:p>
+    <w:p>
+      <w:pPr>
+        <w:rPr>
+          <w:rFonts w:ascii="Arial" w:hAnsi="Arial" w:cs="Arial"/>
+          <w:sz w:val="32"/>
+          <w:szCs w:val="32"/>
+        </w:rPr>
+      </w:pPr>
+      <w:r>
+        <w:rPr>
+          <w:rFonts w:ascii="Arial" w:hAnsi="Arial" w:cs="Arial"/>
+          <w:sz w:val="32"/>
+          <w:szCs w:val="32"/>
+        </w:rPr>
+        <w:t>Quality Control</w:t>
+      </w:r>
+    </w:p>
+    <w:p>
+      <w:pPr>
+        <w:pStyle w:val="33"/>
+        <w:numPr>
+          <w:ilvl w:val="0"/>
+          <w:numId w:val="3"/>
+        </w:numPr>
+        <w:rPr>
+          <w:rFonts w:ascii="Arial" w:hAnsi="Arial" w:cs="Arial"/>
+          <w:sz w:val="32"/>
+          <w:szCs w:val="32"/>
+        </w:rPr>
+      </w:pPr>
+      <w:r>
+        <w:rPr>
+          <w:rFonts w:ascii="Arial" w:hAnsi="Arial" w:cs="Arial"/>
+        </w:rPr>
+        <w:t xml:space="preserve">Independent evaluation </w:t>
+      </w:r>
+    </w:p>
+    <w:p>
+      <w:pPr>
+        <w:pStyle w:val="33"/>
+        <w:numPr>
+          <w:ilvl w:val="0"/>
+          <w:numId w:val="3"/>
+        </w:numPr>
+        <w:rPr>
+          <w:rFonts w:ascii="Arial" w:hAnsi="Arial" w:cs="Arial"/>
+          <w:sz w:val="32"/>
+          <w:szCs w:val="32"/>
+        </w:rPr>
+      </w:pPr>
+      <w:r>
+        <w:rPr>
+          <w:rFonts w:ascii="Arial" w:hAnsi="Arial" w:cs="Arial"/>
+        </w:rPr>
+        <w:t xml:space="preserve">Calibration </w:t>
+      </w:r>
+    </w:p>
+    <w:p>
+      <w:pPr>
+        <w:pStyle w:val="33"/>
+        <w:numPr>
+          <w:ilvl w:val="0"/>
+          <w:numId w:val="3"/>
+        </w:numPr>
+        <w:rPr>
+          <w:rFonts w:ascii="Arial" w:hAnsi="Arial" w:cs="Arial"/>
+          <w:sz w:val="32"/>
+          <w:szCs w:val="32"/>
+        </w:rPr>
+      </w:pPr>
+      <w:r>
+        <w:rPr>
+          <w:rFonts w:ascii="Arial" w:hAnsi="Arial" w:cs="Arial"/>
+        </w:rPr>
+        <w:t xml:space="preserve">Evidence-based adjudication </w:t>
+      </w:r>
+    </w:p>
+    <w:p>
+      <w:pPr>
+        <w:pStyle w:val="33"/>
+        <w:numPr>
+          <w:ilvl w:val="0"/>
+          <w:numId w:val="3"/>
+        </w:numPr>
+        <w:rPr>
+          <w:rFonts w:ascii="Arial" w:hAnsi="Arial" w:cs="Arial"/>
+          <w:sz w:val="32"/>
+          <w:szCs w:val="32"/>
+        </w:rPr>
+      </w:pPr>
+      <w:r>
+        <w:rPr>
+          <w:rFonts w:ascii="Arial" w:hAnsi="Arial" w:cs="Arial"/>
+        </w:rPr>
+        <w:t xml:space="preserve">Disagreement thresholds </w:t>
+      </w:r>
+    </w:p>
+    <w:p>
+      <w:pPr>
+        <w:pStyle w:val="33"/>
+        <w:numPr>
+          <w:ilvl w:val="0"/>
+          <w:numId w:val="3"/>
+        </w:numPr>
+        <w:rPr>
+          <w:rFonts w:ascii="Arial" w:hAnsi="Arial" w:cs="Arial"/>
+          <w:sz w:val="32"/>
+          <w:szCs w:val="32"/>
+        </w:rPr>
+      </w:pPr>
+      <w:r>
+        <w:rPr>
+          <w:rFonts w:ascii="Arial" w:hAnsi="Arial" w:cs="Arial"/>
+        </w:rPr>
+        <w:t>Consistency monitoring</w:t>
+      </w:r>
+    </w:p>
+    <w:p>
+      <w:pPr>
+        <w:rPr>
+          <w:rFonts w:ascii="Arial" w:hAnsi="Arial" w:cs="Arial"/>
+        </w:rPr>
+      </w:pPr>
+      <w:r>
+        <w:rPr>
+          <w:rFonts w:ascii="Arial" w:hAnsi="Arial" w:cs="Arial"/>
+        </w:rPr>
+        <w:t xml:space="preserve">Supporting Document: </w:t>
+      </w:r>
+      <w:r>
+        <w:rPr>
+          <w:rFonts w:ascii="Arial" w:hAnsi="Arial" w:cs="Arial"/>
+        </w:rPr>
+        <w:fldChar w:fldCharType="begin"/>
+      </w:r>
+      <w:r>
+        <w:rPr>
+          <w:rFonts w:ascii="Arial" w:hAnsi="Arial" w:cs="Arial"/>
+        </w:rPr>
+        <w:instrText xml:space="preserve"> HYPERLINK "LLM Response Evaluation  - Quality-Control Rules.docx" </w:instrText>
+      </w:r>
+      <w:r>
+        <w:rPr>
+          <w:rFonts w:ascii="Arial" w:hAnsi="Arial" w:cs="Arial"/>
+        </w:rPr>
+        <w:fldChar w:fldCharType="separate"/>
+      </w:r>
+      <w:r>
+        <w:rPr>
+          <w:rStyle w:val="13"/>
+          <w:rFonts w:ascii="Arial" w:hAnsi="Arial" w:cs="Arial"/>
+        </w:rPr>
+        <w:t>Quality-Control Protocol</w:t>
+      </w:r>
+      <w:r>
+        <w:rPr>
+          <w:rFonts w:ascii="Arial" w:hAnsi="Arial" w:cs="Arial"/>
+        </w:rPr>
+        <w:fldChar w:fldCharType="end"/>
+      </w:r>
+    </w:p>
+    <w:p>
+      <w:pPr>
+        <w:rPr>
+          <w:rFonts w:ascii="Arial" w:hAnsi="Arial" w:cs="Arial"/>
+        </w:rPr>
+      </w:pPr>
+    </w:p>
+    <w:p>
+      <w:pPr>
+        <w:rPr>
+          <w:rFonts w:ascii="Arial" w:hAnsi="Arial" w:cs="Arial"/>
+          <w:sz w:val="32"/>
+          <w:szCs w:val="32"/>
+        </w:rPr>
+      </w:pPr>
+      <w:r>
+        <w:rPr>
+          <w:rFonts w:ascii="Arial" w:hAnsi="Arial" w:cs="Arial"/>
+          <w:sz w:val="32"/>
+          <w:szCs w:val="32"/>
+        </w:rPr>
+        <w:t>Results &amp; Dataset Analysis</w:t>
+      </w:r>
+    </w:p>
+    <w:p>
+      <w:pPr>
+        <w:rPr>
+          <w:rFonts w:ascii="Arial" w:hAnsi="Arial" w:cs="Arial"/>
+          <w:sz w:val="28"/>
+          <w:szCs w:val="28"/>
+        </w:rPr>
+      </w:pPr>
+      <w:r>
+        <w:rPr>
+          <w:rFonts w:ascii="Arial" w:hAnsi="Arial" w:cs="Arial"/>
+          <w:sz w:val="28"/>
+          <w:szCs w:val="28"/>
+        </w:rPr>
+        <w:t>Overall Performance</w:t>
+      </w:r>
+    </w:p>
+    <w:tbl>
+      <w:tblPr>
+        <w:tblStyle w:val="18"/>
+        <w:tblW w:w="0" w:type="auto"/>
+        <w:tblInd w:w="0" w:type="dxa"/>
+        <w:tblBorders>
+          <w:top w:val="single" w:color="auto" w:sz="4" w:space="0"/>
+          <w:left w:val="single" w:color="auto" w:sz="4" w:space="0"/>
+          <w:bottom w:val="single" w:color="auto" w:sz="4" w:space="0"/>
+          <w:right w:val="single" w:color="auto" w:sz="4" w:space="0"/>
+          <w:insideH w:val="single" w:color="auto" w:sz="4" w:space="0"/>
+          <w:insideV w:val="single" w:color="auto" w:sz="4" w:space="0"/>
+        </w:tblBorders>
+        <w:tblLayout w:type="autofit"/>
+        <w:tblCellMar>
+          <w:top w:w="0" w:type="dxa"/>
+          <w:left w:w="108" w:type="dxa"/>
+          <w:bottom w:w="0" w:type="dxa"/>
+          <w:right w:w="108" w:type="dxa"/>
+        </w:tblCellMar>
+      </w:tblPr>
+      <w:tblGrid>
+        <w:gridCol w:w="4788"/>
+        <w:gridCol w:w="4788"/>
+      </w:tblGrid>
+      <w:tr>
+        <w:tblPrEx>
+          <w:tblBorders>
+            <w:top w:val="single" w:color="auto" w:sz="4" w:space="0"/>
+            <w:left w:val="single" w:color="auto" w:sz="4" w:space="0"/>
+            <w:bottom w:val="single" w:color="auto" w:sz="4" w:space="0"/>
+            <w:right w:val="single" w:color="auto" w:sz="4" w:space="0"/>
+            <w:insideH w:val="single" w:color="auto" w:sz="4" w:space="0"/>
+            <w:insideV w:val="single" w:color="auto" w:sz="4" w:space="0"/>
+          </w:tblBorders>
+          <w:tblCellMar>
+            <w:top w:w="0" w:type="dxa"/>
+            <w:left w:w="108" w:type="dxa"/>
+            <w:bottom w:w="0" w:type="dxa"/>
+            <w:right w:w="108" w:type="dxa"/>
+          </w:tblCellMar>
+        </w:tblPrEx>
+        <w:tc>
+          <w:tcPr>
             <w:tcW w:w="4788" w:type="dxa"/>
           </w:tcPr>
           <w:p>
             <w:pPr>
+              <w:widowControl w:val="0"/>
+              <w:jc w:val="both"/>
+              <w:rPr>
+                <w:rFonts w:hint="default" w:ascii="Arial" w:hAnsi="Arial" w:cs="Arial"/>
+                <w:sz w:val="28"/>
+                <w:szCs w:val="28"/>
+                <w:vertAlign w:val="baseline"/>
+                <w:lang w:val="en-US"/>
+              </w:rPr>
+            </w:pPr>
+            <w:r>
+              <w:rPr>
+                <w:rFonts w:hint="default" w:ascii="Arial" w:hAnsi="Arial" w:cs="Arial"/>
+                <w:sz w:val="28"/>
+                <w:szCs w:val="28"/>
+                <w:vertAlign w:val="baseline"/>
+                <w:lang w:val="en-US"/>
+              </w:rPr>
+              <w:t>Metric</w:t>
+            </w:r>
+          </w:p>
+        </w:tc>
+        <w:tc>
+          <w:tcPr>
+            <w:tcW w:w="4788" w:type="dxa"/>
+          </w:tcPr>
+          <w:p>
+            <w:pPr>
+              <w:widowControl w:val="0"/>
+              <w:jc w:val="both"/>
+              <w:rPr>
+                <w:rFonts w:hint="default" w:ascii="Arial" w:hAnsi="Arial" w:cs="Arial"/>
+                <w:sz w:val="28"/>
+                <w:szCs w:val="28"/>
+                <w:vertAlign w:val="baseline"/>
+                <w:lang w:val="en-US"/>
+              </w:rPr>
+            </w:pPr>
+            <w:r>
+              <w:rPr>
+                <w:rFonts w:hint="default" w:ascii="Arial" w:hAnsi="Arial" w:cs="Arial"/>
+                <w:sz w:val="28"/>
+                <w:szCs w:val="28"/>
+                <w:vertAlign w:val="baseline"/>
+                <w:lang w:val="en-US"/>
+              </w:rPr>
+              <w:t>Result</w:t>
+            </w:r>
+          </w:p>
+        </w:tc>
+      </w:tr>
+      <w:tr>
+        <w:tblPrEx>
+          <w:tblBorders>
+            <w:top w:val="single" w:color="auto" w:sz="4" w:space="0"/>
+            <w:left w:val="single" w:color="auto" w:sz="4" w:space="0"/>
+            <w:bottom w:val="single" w:color="auto" w:sz="4" w:space="0"/>
+            <w:right w:val="single" w:color="auto" w:sz="4" w:space="0"/>
+            <w:insideH w:val="single" w:color="auto" w:sz="4" w:space="0"/>
+            <w:insideV w:val="single" w:color="auto" w:sz="4" w:space="0"/>
+          </w:tblBorders>
+          <w:tblCellMar>
+            <w:top w:w="0" w:type="dxa"/>
+            <w:left w:w="108" w:type="dxa"/>
+            <w:bottom w:w="0" w:type="dxa"/>
+            <w:right w:w="108" w:type="dxa"/>
+          </w:tblCellMar>
+        </w:tblPrEx>
+        <w:tc>
+          <w:tcPr>
+            <w:tcW w:w="4788" w:type="dxa"/>
+          </w:tcPr>
+          <w:p>
+            <w:pPr>
+              <w:widowControl w:val="0"/>
+              <w:jc w:val="both"/>
+              <w:rPr>
+                <w:rFonts w:hint="default" w:ascii="Arial" w:hAnsi="Arial" w:cs="Arial"/>
+                <w:sz w:val="28"/>
+                <w:szCs w:val="28"/>
+                <w:vertAlign w:val="baseline"/>
+                <w:lang w:val="en-US"/>
+              </w:rPr>
+            </w:pPr>
+            <w:r>
+              <w:rPr>
+                <w:rFonts w:hint="default" w:ascii="Arial" w:hAnsi="Arial" w:cs="Arial"/>
+                <w:sz w:val="28"/>
+                <w:szCs w:val="28"/>
+                <w:vertAlign w:val="baseline"/>
+                <w:lang w:val="en-US"/>
+              </w:rPr>
+              <w:t>Total Responses Evaluated</w:t>
+            </w:r>
+          </w:p>
+        </w:tc>
+        <w:tc>
+          <w:tcPr>
+            <w:tcW w:w="4788" w:type="dxa"/>
+          </w:tcPr>
+          <w:p>
+            <w:pPr>
+              <w:widowControl w:val="0"/>
+              <w:jc w:val="both"/>
+              <w:rPr>
+                <w:rFonts w:hint="default" w:ascii="Arial" w:hAnsi="Arial" w:cs="Arial"/>
+                <w:sz w:val="28"/>
+                <w:szCs w:val="28"/>
+                <w:vertAlign w:val="baseline"/>
+                <w:lang w:val="en-US"/>
+              </w:rPr>
+            </w:pPr>
+            <w:r>
+              <w:rPr>
+                <w:rFonts w:hint="default" w:ascii="Arial" w:hAnsi="Arial" w:cs="Arial"/>
+                <w:sz w:val="28"/>
+                <w:szCs w:val="28"/>
+                <w:vertAlign w:val="baseline"/>
+                <w:lang w:val="en-US"/>
+              </w:rPr>
+              <w:t>30</w:t>
+            </w:r>
+          </w:p>
+        </w:tc>
+      </w:tr>
+      <w:tr>
+        <w:tblPrEx>
+          <w:tblBorders>
+            <w:top w:val="single" w:color="auto" w:sz="4" w:space="0"/>
+            <w:left w:val="single" w:color="auto" w:sz="4" w:space="0"/>
+            <w:bottom w:val="single" w:color="auto" w:sz="4" w:space="0"/>
+            <w:right w:val="single" w:color="auto" w:sz="4" w:space="0"/>
+            <w:insideH w:val="single" w:color="auto" w:sz="4" w:space="0"/>
+            <w:insideV w:val="single" w:color="auto" w:sz="4" w:space="0"/>
+          </w:tblBorders>
+          <w:tblCellMar>
+            <w:top w:w="0" w:type="dxa"/>
+            <w:left w:w="108" w:type="dxa"/>
+            <w:bottom w:w="0" w:type="dxa"/>
+            <w:right w:w="108" w:type="dxa"/>
+          </w:tblCellMar>
+        </w:tblPrEx>
+        <w:tc>
+          <w:tcPr>
+            <w:tcW w:w="4788" w:type="dxa"/>
+          </w:tcPr>
+          <w:p>
+            <w:pPr>
+              <w:widowControl w:val="0"/>
+              <w:jc w:val="both"/>
+              <w:rPr>
+                <w:rFonts w:hint="default" w:ascii="Arial" w:hAnsi="Arial" w:cs="Arial"/>
+                <w:sz w:val="28"/>
+                <w:szCs w:val="28"/>
+                <w:vertAlign w:val="baseline"/>
+                <w:lang w:val="en-US"/>
+              </w:rPr>
+            </w:pPr>
+            <w:r>
+              <w:rPr>
+                <w:rFonts w:hint="default" w:ascii="Arial" w:hAnsi="Arial" w:cs="Arial"/>
+                <w:sz w:val="28"/>
+                <w:szCs w:val="28"/>
+                <w:vertAlign w:val="baseline"/>
+                <w:lang w:val="en-US"/>
+              </w:rPr>
+              <w:t>Responses with no identified errors</w:t>
+            </w:r>
+          </w:p>
+        </w:tc>
+        <w:tc>
+          <w:tcPr>
+            <w:tcW w:w="4788" w:type="dxa"/>
+          </w:tcPr>
+          <w:p>
+            <w:pPr>
+              <w:widowControl w:val="0"/>
+              <w:jc w:val="both"/>
+              <w:rPr>
+                <w:rFonts w:hint="default" w:ascii="Arial" w:hAnsi="Arial" w:cs="Arial"/>
+                <w:sz w:val="28"/>
+                <w:szCs w:val="28"/>
+                <w:vertAlign w:val="baseline"/>
+                <w:lang w:val="en-US"/>
+              </w:rPr>
+            </w:pPr>
+            <w:r>
+              <w:rPr>
+                <w:rFonts w:hint="default" w:ascii="Arial" w:hAnsi="Arial" w:cs="Arial"/>
+                <w:sz w:val="28"/>
+                <w:szCs w:val="28"/>
+                <w:vertAlign w:val="baseline"/>
+                <w:lang w:val="en-US"/>
+              </w:rPr>
+              <w:t>40%</w:t>
+            </w:r>
+          </w:p>
+        </w:tc>
+      </w:tr>
+      <w:tr>
+        <w:tblPrEx>
+          <w:tblBorders>
+            <w:top w:val="single" w:color="auto" w:sz="4" w:space="0"/>
+            <w:left w:val="single" w:color="auto" w:sz="4" w:space="0"/>
+            <w:bottom w:val="single" w:color="auto" w:sz="4" w:space="0"/>
+            <w:right w:val="single" w:color="auto" w:sz="4" w:space="0"/>
+            <w:insideH w:val="single" w:color="auto" w:sz="4" w:space="0"/>
+            <w:insideV w:val="single" w:color="auto" w:sz="4" w:space="0"/>
+          </w:tblBorders>
+          <w:tblCellMar>
+            <w:top w:w="0" w:type="dxa"/>
+            <w:left w:w="108" w:type="dxa"/>
+            <w:bottom w:w="0" w:type="dxa"/>
+            <w:right w:w="108" w:type="dxa"/>
+          </w:tblCellMar>
+        </w:tblPrEx>
+        <w:tc>
+          <w:tcPr>
+            <w:tcW w:w="4788" w:type="dxa"/>
+          </w:tcPr>
+          <w:p>
+            <w:pPr>
+              <w:widowControl w:val="0"/>
+              <w:jc w:val="both"/>
+              <w:rPr>
+                <w:rFonts w:hint="default" w:ascii="Arial" w:hAnsi="Arial" w:cs="Arial"/>
+                <w:sz w:val="28"/>
+                <w:szCs w:val="28"/>
+                <w:vertAlign w:val="baseline"/>
+                <w:lang w:val="en-US"/>
+              </w:rPr>
+            </w:pPr>
+            <w:r>
+              <w:rPr>
+                <w:rFonts w:hint="default" w:ascii="Arial" w:hAnsi="Arial" w:cs="Arial"/>
+                <w:sz w:val="28"/>
+                <w:szCs w:val="28"/>
+                <w:vertAlign w:val="baseline"/>
+                <w:lang w:val="en-US"/>
+              </w:rPr>
+              <w:t>Responses with errors</w:t>
+            </w:r>
+          </w:p>
+        </w:tc>
+        <w:tc>
+          <w:tcPr>
+            <w:tcW w:w="4788" w:type="dxa"/>
+          </w:tcPr>
+          <w:p>
+            <w:pPr>
+              <w:widowControl w:val="0"/>
+              <w:jc w:val="both"/>
+              <w:rPr>
+                <w:rFonts w:hint="default" w:ascii="Arial" w:hAnsi="Arial" w:cs="Arial"/>
+                <w:sz w:val="28"/>
+                <w:szCs w:val="28"/>
+                <w:vertAlign w:val="baseline"/>
+                <w:lang w:val="en-US"/>
+              </w:rPr>
+            </w:pPr>
+            <w:r>
+              <w:rPr>
+                <w:rFonts w:hint="default" w:ascii="Arial" w:hAnsi="Arial" w:cs="Arial"/>
+                <w:sz w:val="28"/>
+                <w:szCs w:val="28"/>
+                <w:vertAlign w:val="baseline"/>
+                <w:lang w:val="en-US"/>
+              </w:rPr>
+              <w:t>60%</w:t>
+            </w:r>
+          </w:p>
+        </w:tc>
+      </w:tr>
+      <w:tr>
+        <w:tblPrEx>
+          <w:tblBorders>
+            <w:top w:val="single" w:color="auto" w:sz="4" w:space="0"/>
+            <w:left w:val="single" w:color="auto" w:sz="4" w:space="0"/>
+            <w:bottom w:val="single" w:color="auto" w:sz="4" w:space="0"/>
+            <w:right w:val="single" w:color="auto" w:sz="4" w:space="0"/>
+            <w:insideH w:val="single" w:color="auto" w:sz="4" w:space="0"/>
+            <w:insideV w:val="single" w:color="auto" w:sz="4" w:space="0"/>
+          </w:tblBorders>
+          <w:tblCellMar>
+            <w:top w:w="0" w:type="dxa"/>
+            <w:left w:w="108" w:type="dxa"/>
+            <w:bottom w:w="0" w:type="dxa"/>
+            <w:right w:w="108" w:type="dxa"/>
+          </w:tblCellMar>
+        </w:tblPrEx>
+        <w:tc>
+          <w:tcPr>
+            <w:tcW w:w="4788" w:type="dxa"/>
+          </w:tcPr>
+          <w:p>
+            <w:pPr>
+              <w:widowControl w:val="0"/>
+              <w:jc w:val="both"/>
               <w:rPr>
                 <w:rFonts w:hint="default" w:ascii="Arial" w:hAnsi="Arial" w:cs="Arial"/>
                 <w:sz w:val="28"/>
@@ -2340,6 +2474,8 @@
           </w:tcPr>
           <w:p>
             <w:pPr>
+              <w:widowControl w:val="0"/>
+              <w:jc w:val="both"/>
               <w:rPr>
                 <w:rFonts w:hint="default" w:ascii="Arial" w:hAnsi="Arial" w:cs="Arial"/>
                 <w:sz w:val="28"/>
@@ -2583,8 +2719,8 @@
         </w:rPr>
         <w:drawing>
           <wp:inline distT="0" distB="0" distL="114300" distR="114300">
-            <wp:extent cx="6012180" cy="3611880"/>
-            <wp:effectExtent l="0" t="0" r="7620" b="7620"/>
+            <wp:extent cx="5553710" cy="3336290"/>
+            <wp:effectExtent l="0" t="0" r="8890" b="3810"/>
             <wp:docPr id="3" name="Picture 3" descr="Evaluation Criterion Chart"/>
             <wp:cNvGraphicFramePr>
               <a:graphicFrameLocks xmlns:a="http://schemas.openxmlformats.org/drawingml/2006/main" noChangeAspect="1"/>
@@ -2607,7 +2743,7 @@
                   <pic:spPr>
                     <a:xfrm>
                       <a:off x="0" y="0"/>
-                      <a:ext cx="6012180" cy="3611880"/>
+                      <a:ext cx="5553710" cy="3336290"/>
                     </a:xfrm>
                     <a:prstGeom prst="rect">
                       <a:avLst/>
@@ -2652,7 +2788,7 @@
     </w:p>
     <w:p>
       <w:pPr>
-        <w:pStyle w:val="13"/>
+        <w:pStyle w:val="15"/>
         <w:keepNext w:val="0"/>
         <w:keepLines w:val="0"/>
         <w:widowControl/>
@@ -2672,7 +2808,7 @@
     </w:p>
     <w:p>
       <w:pPr>
-        <w:pStyle w:val="13"/>
+        <w:pStyle w:val="15"/>
         <w:keepNext w:val="0"/>
         <w:keepLines w:val="0"/>
         <w:widowControl/>
@@ -3303,7 +3439,6 @@
           <w:szCs w:val="32"/>
         </w:rPr>
       </w:pPr>
-      <w:bookmarkStart w:id="0" w:name="_GoBack"/>
       <w:r>
         <w:rPr>
           <w:rFonts w:ascii="Arial" w:hAnsi="Arial" w:cs="Arial"/>
@@ -3313,7 +3448,6 @@
         <w:t>Conclusion</w:t>
       </w:r>
     </w:p>
-    <w:bookmarkEnd w:id="0"/>
     <w:p>
       <w:pPr>
         <w:rPr>
@@ -4124,7 +4258,7 @@
     <w:lsdException w:uiPriority="99" w:name="HTML Sample"/>
     <w:lsdException w:uiPriority="99" w:name="HTML Typewriter"/>
     <w:lsdException w:uiPriority="99" w:name="HTML Variable"/>
-    <w:lsdException w:uiPriority="99" w:name="Normal Table"/>
+    <w:lsdException w:qFormat="1" w:uiPriority="99" w:name="Normal Table"/>
     <w:lsdException w:uiPriority="99" w:name="annotation subject"/>
     <w:lsdException w:uiPriority="99" w:name="Table Simple 1"/>
     <w:lsdException w:uiPriority="99" w:name="Table Simple 2"/>
@@ -4169,7 +4303,7 @@
     <w:lsdException w:uiPriority="99" w:name="Table Web 2"/>
     <w:lsdException w:uiPriority="99" w:name="Table Web 3"/>
     <w:lsdException w:uiPriority="99" w:name="Balloon Text"/>
-    <w:lsdException w:unhideWhenUsed="0" w:uiPriority="39" w:semiHidden="0" w:name="Table Grid"/>
+    <w:lsdException w:qFormat="1" w:unhideWhenUsed="0" w:uiPriority="39" w:semiHidden="0" w:name="Table Grid"/>
     <w:lsdException w:uiPriority="99" w:name="Table Theme"/>
     <w:lsdException w:unhideWhenUsed="0" w:uiPriority="60" w:semiHidden="0" w:name="Light Shading"/>
     <w:lsdException w:unhideWhenUsed="0" w:uiPriority="61" w:semiHidden="0" w:name="Light List"/>
@@ -4293,7 +4427,7 @@
     <w:name w:val="heading 1"/>
     <w:basedOn w:val="1"/>
     <w:next w:val="1"/>
-    <w:link w:val="18"/>
+    <w:link w:val="20"/>
     <w:qFormat/>
     <w:uiPriority w:val="9"/>
     <w:pPr>
@@ -4313,7 +4447,7 @@
     <w:name w:val="heading 2"/>
     <w:basedOn w:val="1"/>
     <w:next w:val="1"/>
-    <w:link w:val="19"/>
+    <w:link w:val="21"/>
     <w:semiHidden/>
     <w:unhideWhenUsed/>
     <w:qFormat/>
@@ -4335,7 +4469,7 @@
     <w:name w:val="heading 3"/>
     <w:basedOn w:val="1"/>
     <w:next w:val="1"/>
-    <w:link w:val="20"/>
+    <w:link w:val="22"/>
     <w:semiHidden/>
     <w:unhideWhenUsed/>
     <w:qFormat/>
@@ -4357,7 +4491,7 @@
     <w:name w:val="heading 4"/>
     <w:basedOn w:val="1"/>
     <w:next w:val="1"/>
-    <w:link w:val="21"/>
+    <w:link w:val="23"/>
     <w:semiHidden/>
     <w:unhideWhenUsed/>
     <w:qFormat/>
@@ -4379,7 +4513,7 @@
     <w:name w:val="heading 5"/>
     <w:basedOn w:val="1"/>
     <w:next w:val="1"/>
-    <w:link w:val="22"/>
+    <w:link w:val="24"/>
     <w:semiHidden/>
     <w:unhideWhenUsed/>
     <w:qFormat/>
@@ -4399,7 +4533,7 @@
     <w:name w:val="heading 6"/>
     <w:basedOn w:val="1"/>
     <w:next w:val="1"/>
-    <w:link w:val="23"/>
+    <w:link w:val="25"/>
     <w:semiHidden/>
     <w:unhideWhenUsed/>
     <w:qFormat/>
@@ -4429,7 +4563,7 @@
     <w:name w:val="heading 7"/>
     <w:basedOn w:val="1"/>
     <w:next w:val="1"/>
-    <w:link w:val="24"/>
+    <w:link w:val="26"/>
     <w:semiHidden/>
     <w:unhideWhenUsed/>
     <w:qFormat/>
@@ -4457,7 +4591,7 @@
     <w:name w:val="heading 8"/>
     <w:basedOn w:val="1"/>
     <w:next w:val="1"/>
-    <w:link w:val="25"/>
+    <w:link w:val="27"/>
     <w:semiHidden/>
     <w:unhideWhenUsed/>
     <w:qFormat/>
@@ -4487,7 +4621,7 @@
     <w:name w:val="heading 9"/>
     <w:basedOn w:val="1"/>
     <w:next w:val="1"/>
-    <w:link w:val="26"/>
+    <w:link w:val="28"/>
     <w:semiHidden/>
     <w:unhideWhenUsed/>
     <w:qFormat/>
@@ -4521,6 +4655,7 @@
     <w:name w:val="Normal Table"/>
     <w:semiHidden/>
     <w:unhideWhenUsed/>
+    <w:qFormat/>
     <w:uiPriority w:val="99"/>
     <w:tblPr>
       <w:tblCellMar>
@@ -4531,7 +4666,29 @@
       </w:tblCellMar>
     </w:tblPr>
   </w:style>
-  <w:style w:type="paragraph" w:styleId="13">
+  <w:style w:type="character" w:styleId="13">
+    <w:name w:val="FollowedHyperlink"/>
+    <w:basedOn w:val="11"/>
+    <w:semiHidden/>
+    <w:unhideWhenUsed/>
+    <w:uiPriority w:val="99"/>
+    <w:rPr>
+      <w:color w:val="800080"/>
+      <w:u w:val="single"/>
+    </w:rPr>
+  </w:style>
+  <w:style w:type="character" w:styleId="14">
+    <w:name w:val="Hyperlink"/>
+    <w:basedOn w:val="11"/>
+    <w:semiHidden/>
+    <w:unhideWhenUsed/>
+    <w:uiPriority w:val="99"/>
+    <w:rPr>
+      <w:color w:val="0000FF"/>
+      <w:u w:val="single"/>
+    </w:rPr>
+  </w:style>
+  <w:style w:type="paragraph" w:styleId="15">
     <w:name w:val="Normal (Web)"/>
     <w:basedOn w:val="1"/>
     <w:semiHidden/>
@@ -4547,7 +4704,7 @@
       <w14:ligatures w14:val="none"/>
     </w:rPr>
   </w:style>
-  <w:style w:type="character" w:styleId="14">
+  <w:style w:type="character" w:styleId="16">
     <w:name w:val="Strong"/>
     <w:basedOn w:val="11"/>
     <w:qFormat/>
@@ -4557,11 +4714,11 @@
       <w:bCs/>
     </w:rPr>
   </w:style>
-  <w:style w:type="paragraph" w:styleId="15">
+  <w:style w:type="paragraph" w:styleId="17">
     <w:name w:val="Subtitle"/>
     <w:basedOn w:val="1"/>
     <w:next w:val="1"/>
-    <w:link w:val="28"/>
+    <w:link w:val="30"/>
     <w:qFormat/>
     <w:uiPriority w:val="11"/>
     <w:rPr>
@@ -4580,9 +4737,10 @@
       </w14:textFill>
     </w:rPr>
   </w:style>
-  <w:style w:type="table" w:styleId="16">
+  <w:style w:type="table" w:styleId="18">
     <w:name w:val="Table Grid"/>
     <w:basedOn w:val="12"/>
+    <w:qFormat/>
     <w:uiPriority w:val="39"/>
     <w:pPr>
       <w:widowControl w:val="0"/>
@@ -4599,11 +4757,11 @@
       </w:tblBorders>
     </w:tblPr>
   </w:style>
-  <w:style w:type="paragraph" w:styleId="17">
+  <w:style w:type="paragraph" w:styleId="19">
     <w:name w:val="Title"/>
     <w:basedOn w:val="1"/>
     <w:next w:val="1"/>
-    <w:link w:val="27"/>
+    <w:link w:val="29"/>
     <w:qFormat/>
     <w:uiPriority w:val="10"/>
     <w:pPr>
@@ -4618,7 +4776,7 @@
       <w:szCs w:val="56"/>
     </w:rPr>
   </w:style>
-  <w:style w:type="character" w:customStyle="1" w:styleId="18">
+  <w:style w:type="character" w:customStyle="1" w:styleId="20">
     <w:name w:val="Heading 1 Char"/>
     <w:basedOn w:val="11"/>
     <w:link w:val="2"/>
@@ -4631,7 +4789,7 @@
       <w:szCs w:val="40"/>
     </w:rPr>
   </w:style>
-  <w:style w:type="character" w:customStyle="1" w:styleId="19">
+  <w:style w:type="character" w:customStyle="1" w:styleId="21">
     <w:name w:val="Heading 2 Char"/>
     <w:basedOn w:val="11"/>
     <w:link w:val="3"/>
@@ -4645,11 +4803,12 @@
       <w:szCs w:val="32"/>
     </w:rPr>
   </w:style>
-  <w:style w:type="character" w:customStyle="1" w:styleId="20">
+  <w:style w:type="character" w:customStyle="1" w:styleId="22">
     <w:name w:val="Heading 3 Char"/>
     <w:basedOn w:val="11"/>
     <w:link w:val="4"/>
     <w:semiHidden/>
+    <w:qFormat/>
     <w:uiPriority w:val="9"/>
     <w:rPr>
       <w:rFonts w:eastAsiaTheme="majorEastAsia" w:cstheme="majorBidi"/>
@@ -4658,7 +4817,7 @@
       <w:szCs w:val="28"/>
     </w:rPr>
   </w:style>
-  <w:style w:type="character" w:customStyle="1" w:styleId="21">
+  <w:style w:type="character" w:customStyle="1" w:styleId="23">
     <w:name w:val="Heading 4 Char"/>
     <w:basedOn w:val="11"/>
     <w:link w:val="5"/>
@@ -4672,7 +4831,7 @@
       <w:color w:val="104862" w:themeColor="accent1" w:themeShade="BF"/>
     </w:rPr>
   </w:style>
-  <w:style w:type="character" w:customStyle="1" w:styleId="22">
+  <w:style w:type="character" w:customStyle="1" w:styleId="24">
     <w:name w:val="Heading 5 Char"/>
     <w:basedOn w:val="11"/>
     <w:link w:val="6"/>
@@ -4684,7 +4843,7 @@
       <w:color w:val="104862" w:themeColor="accent1" w:themeShade="BF"/>
     </w:rPr>
   </w:style>
-  <w:style w:type="character" w:customStyle="1" w:styleId="23">
+  <w:style w:type="character" w:customStyle="1" w:styleId="25">
     <w:name w:val="Heading 6 Char"/>
     <w:basedOn w:val="11"/>
     <w:link w:val="7"/>
@@ -4706,11 +4865,12 @@
       </w14:textFill>
     </w:rPr>
   </w:style>
-  <w:style w:type="character" w:customStyle="1" w:styleId="24">
+  <w:style w:type="character" w:customStyle="1" w:styleId="26">
     <w:name w:val="Heading 7 Char"/>
     <w:basedOn w:val="11"/>
     <w:link w:val="8"/>
     <w:semiHidden/>
+    <w:qFormat/>
     <w:uiPriority w:val="9"/>
     <w:rPr>
       <w:rFonts w:eastAsiaTheme="majorEastAsia" w:cstheme="majorBidi"/>
@@ -4725,11 +4885,12 @@
       </w14:textFill>
     </w:rPr>
   </w:style>
-  <w:style w:type="character" w:customStyle="1" w:styleId="25">
+  <w:style w:type="character" w:customStyle="1" w:styleId="27">
     <w:name w:val="Heading 8 Char"/>
     <w:basedOn w:val="11"/>
     <w:link w:val="9"/>
     <w:semiHidden/>
+    <w:qFormat/>
     <w:uiPriority w:val="9"/>
     <w:rPr>
       <w:rFonts w:eastAsiaTheme="majorEastAsia" w:cstheme="majorBidi"/>
@@ -4746,7 +4907,7 @@
       </w14:textFill>
     </w:rPr>
   </w:style>
-  <w:style w:type="character" w:customStyle="1" w:styleId="26">
+  <w:style w:type="character" w:customStyle="1" w:styleId="28">
     <w:name w:val="Heading 9 Char"/>
     <w:basedOn w:val="11"/>
     <w:link w:val="10"/>
@@ -4766,10 +4927,10 @@
       </w14:textFill>
     </w:rPr>
   </w:style>
-  <w:style w:type="character" w:customStyle="1" w:styleId="27">
+  <w:style w:type="character" w:customStyle="1" w:styleId="29">
     <w:name w:val="Title Char"/>
     <w:basedOn w:val="11"/>
-    <w:link w:val="17"/>
+    <w:link w:val="19"/>
     <w:qFormat/>
     <w:uiPriority w:val="10"/>
     <w:rPr>
@@ -4780,10 +4941,10 @@
       <w:szCs w:val="56"/>
     </w:rPr>
   </w:style>
-  <w:style w:type="character" w:customStyle="1" w:styleId="28">
+  <w:style w:type="character" w:customStyle="1" w:styleId="30">
     <w:name w:val="Subtitle Char"/>
     <w:basedOn w:val="11"/>
-    <w:link w:val="15"/>
+    <w:link w:val="17"/>
     <w:qFormat/>
     <w:uiPriority w:val="11"/>
     <w:rPr>
@@ -4802,11 +4963,11 @@
       </w14:textFill>
     </w:rPr>
   </w:style>
-  <w:style w:type="paragraph" w:styleId="29">
+  <w:style w:type="paragraph" w:styleId="31">
     <w:name w:val="Quote"/>
     <w:basedOn w:val="1"/>
     <w:next w:val="1"/>
-    <w:link w:val="30"/>
+    <w:link w:val="32"/>
     <w:qFormat/>
     <w:uiPriority w:val="29"/>
     <w:pPr>
@@ -4827,10 +4988,11 @@
       </w14:textFill>
     </w:rPr>
   </w:style>
-  <w:style w:type="character" w:customStyle="1" w:styleId="30">
+  <w:style w:type="character" w:customStyle="1" w:styleId="32">
     <w:name w:val="Quote Char"/>
     <w:basedOn w:val="11"/>
-    <w:link w:val="29"/>
+    <w:link w:val="31"/>
+    <w:qFormat/>
     <w:uiPriority w:val="29"/>
     <w:rPr>
       <w:i/>
@@ -4846,7 +5008,7 @@
       </w14:textFill>
     </w:rPr>
   </w:style>
-  <w:style w:type="paragraph" w:styleId="31">
+  <w:style w:type="paragraph" w:styleId="33">
     <w:name w:val="List Paragraph"/>
     <w:basedOn w:val="1"/>
     <w:qFormat/>
@@ -4856,7 +5018,7 @@
       <w:contextualSpacing/>
     </w:pPr>
   </w:style>
-  <w:style w:type="character" w:customStyle="1" w:styleId="32">
+  <w:style w:type="character" w:customStyle="1" w:styleId="34">
     <w:name w:val="Intense Emphasis"/>
     <w:basedOn w:val="11"/>
     <w:qFormat/>
@@ -4867,11 +5029,11 @@
       <w:color w:val="104862" w:themeColor="accent1" w:themeShade="BF"/>
     </w:rPr>
   </w:style>
-  <w:style w:type="paragraph" w:styleId="33">
+  <w:style w:type="paragraph" w:styleId="35">
     <w:name w:val="Intense Quote"/>
     <w:basedOn w:val="1"/>
     <w:next w:val="1"/>
-    <w:link w:val="34"/>
+    <w:link w:val="36"/>
     <w:qFormat/>
     <w:uiPriority w:val="30"/>
     <w:pPr>
@@ -4889,10 +5051,11 @@
       <w:color w:val="104862" w:themeColor="accent1" w:themeShade="BF"/>
     </w:rPr>
   </w:style>
-  <w:style w:type="character" w:customStyle="1" w:styleId="34">
+  <w:style w:type="character" w:customStyle="1" w:styleId="36">
     <w:name w:val="Intense Quote Char"/>
     <w:basedOn w:val="11"/>
-    <w:link w:val="33"/>
+    <w:link w:val="35"/>
+    <w:qFormat/>
     <w:uiPriority w:val="30"/>
     <w:rPr>
       <w:i/>
@@ -4900,7 +5063,7 @@
       <w:color w:val="104862" w:themeColor="accent1" w:themeShade="BF"/>
     </w:rPr>
   </w:style>
-  <w:style w:type="character" w:customStyle="1" w:styleId="35">
+  <w:style w:type="character" w:customStyle="1" w:styleId="37">
     <w:name w:val="Intense Reference"/>
     <w:basedOn w:val="11"/>
     <w:qFormat/>
@@ -4913,7 +5076,7 @@
       <w:spacing w:val="5"/>
     </w:rPr>
   </w:style>
-  <w:style w:type="paragraph" w:customStyle="1" w:styleId="36">
+  <w:style w:type="paragraph" w:customStyle="1" w:styleId="38">
     <w:name w:val="pdq2pg_selectionanchorcontainer"/>
     <w:basedOn w:val="1"/>
     <w:qFormat/>

</xml_diff>